<commit_message>
docs(tutorials): W-1 updated from the sessions re-run under the revised assistant (diagnosis now finds all three planted faults with a ranked table; corpus examples and engine β in the conceptual answers; report verified); cost table recomputed
Co-Authored-By: Claude Fable 5 <noreply@anthropic.com>
Claude-Session: https://claude.ai/code/session_01XjjT2aBxw8gY7EFdpoUcpj
</commit_message>
<xml_diff>
--- a/docs/tutorials/files/w1_report_after.docx
+++ b/docs/tutorials/files/w1_report_after.docx
@@ -21,7 +21,7 @@
         <w:fldChar w:fldCharType="separate"/>
       </w:r>
       <w:r>
-        <w:t>Reinforced Slope — Spencer Analysis</w:t>
+        <w:t>Slope Stability Analysis</w:t>
       </w:r>
       <w:r>
         <w:fldChar w:fldCharType="end"/>
@@ -476,7 +476,7 @@
                 <w:b w:val="0"/>
                 <w:sz w:val="20"/>
               </w:rPr>
-              <w:t>2026-08-27 16:10</w:t>
+              <w:t>2026-08-27 20:17</w:t>
             </w:r>
           </w:p>
         </w:tc>
@@ -3739,6 +3739,53 @@
                 <w:sz w:val="20"/>
               </w:rPr>
               <w:t>Trial surfaces evaluated</w:t>
+            </w:r>
+          </w:p>
+        </w:tc>
+        <w:tc>
+          <w:tcPr>
+            <w:tcW w:type="dxa" w:w="4656"/>
+            <w:noWrap/>
+            <w:vAlign w:val="center"/>
+          </w:tcPr>
+          <w:p>
+            <w:pPr>
+              <w:spacing w:before="0" w:after="0" w:line="240" w:lineRule="auto"/>
+              <w:rPr>
+                <w:sz w:val="20"/>
+                <w:szCs w:val="20"/>
+              </w:rPr>
+            </w:pPr>
+            <w:r>
+              <w:rPr>
+                <w:b w:val="0"/>
+                <w:sz w:val="20"/>
+              </w:rPr>
+              <w:t>838</w:t>
+            </w:r>
+          </w:p>
+        </w:tc>
+      </w:tr>
+      <w:tr>
+        <w:tc>
+          <w:tcPr>
+            <w:tcW w:type="dxa" w:w="2496"/>
+            <w:vAlign w:val="center"/>
+          </w:tcPr>
+          <w:p>
+            <w:pPr>
+              <w:spacing w:before="0" w:after="0" w:line="240" w:lineRule="auto"/>
+              <w:rPr>
+                <w:sz w:val="20"/>
+                <w:szCs w:val="20"/>
+              </w:rPr>
+            </w:pPr>
+            <w:r>
+              <w:rPr>
+                <w:b/>
+                <w:sz w:val="20"/>
+              </w:rPr>
+              <w:t>Grid centers refined</w:t>
             </w:r>
           </w:p>
         </w:tc>
@@ -29369,7 +29416,7 @@
       <w:rPr>
         <w:sz w:val="18"/>
       </w:rPr>
-      <w:t>Reinforced Slope — Spencer Analysis</w:t>
+      <w:t>Slope Stability Analysis</w:t>
     </w:r>
     <w:r>
       <w:rPr>
@@ -29414,7 +29461,7 @@
       <w:rPr>
         <w:sz w:val="18"/>
       </w:rPr>
-      <w:t>Reinforced Slope — Spencer Analysis</w:t>
+      <w:t>Slope Stability Analysis</w:t>
     </w:r>
     <w:r>
       <w:rPr>
@@ -29530,7 +29577,7 @@
       <w:rPr>
         <w:sz w:val="18"/>
       </w:rPr>
-      <w:t>Reinforced Slope — Spencer Analysis</w:t>
+      <w:t>Slope Stability Analysis</w:t>
     </w:r>
     <w:r>
       <w:rPr>
@@ -29645,7 +29692,7 @@
       <w:rPr>
         <w:sz w:val="18"/>
       </w:rPr>
-      <w:t>Reinforced Slope — Spencer Analysis</w:t>
+      <w:t>Slope Stability Analysis</w:t>
     </w:r>
     <w:r>
       <w:rPr>

</xml_diff>